<commit_message>
Szablon umowy rezerwacyjnej: nowe oznaczenie dzialek po wtornym podziale
Par. 1 pkt 1: cztery dzialki 43/3, 43/4, 44/8, 44/9 (lacznie 0,3757 ha)
zamiast 43/1 i 44/6; dzialki objete KW LD1G/00227305 ("ktore objete sa"
zamiast "beda objete"). Par. 2 ust. 6: "oznaczonych numerami 43/3 i 44/8"
zamiast "o projektowanych numerach" (podzial dokonany).

Edycja bezposrednio w templates/umowa-rezerwacyjna.docx (podmiana akapitow
na pojedyncze runy z zachowaniem pPr/rPr). Wszystkie 45 kotwic {{...}}
nienaruszone; render docxtemplater z danymi testowymi przechodzi.

Co-Authored-By: Claude Fable 5 <noreply@anthropic.com>
</commit_message>
<xml_diff>
--- a/templates/umowa-rezerwacyjna.docx
+++ b/templates/umowa-rezerwacyjna.docx
@@ -860,166 +860,7 @@
           <w:sz w:val="24"/>
           <w:szCs w:val="24"/>
         </w:rPr>
-        <w:t xml:space="preserve">Przedstawiciel Dewelopera oświadcza, że na nieruchomości </w:t>
-      </w:r>
-      <w:r>
-        <w:rPr>
-          <w:rFonts w:ascii="Calibri" w:hAnsi="Calibri" w:cs="Calibri"/>
-          <w:iCs/>
-          <w:sz w:val="24"/>
-          <w:szCs w:val="24"/>
-        </w:rPr>
-        <w:t xml:space="preserve">obejmującej teren </w:t>
-      </w:r>
-      <w:r>
-        <w:rPr>
-          <w:rFonts w:ascii="Calibri" w:hAnsi="Calibri" w:cs="Calibri"/>
-          <w:color w:val="000000"/>
-          <w:sz w:val="24"/>
-          <w:szCs w:val="24"/>
-        </w:rPr>
-        <w:t xml:space="preserve">składający się z leżących w obrębie ewidencyjnym 0125 Zgierz 125, jednostce ewidencyjnej 102003_1 Zgierz – miasto dwóch działek gruntu oznaczonych numerami </w:t>
-      </w:r>
-      <w:bookmarkStart w:id="4" w:name="_Hlk169862451"/>
-      <w:r>
-        <w:rPr>
-          <w:rFonts w:ascii="Calibri" w:hAnsi="Calibri" w:cs="Calibri"/>
-          <w:color w:val="000000"/>
-          <w:sz w:val="24"/>
-          <w:szCs w:val="24"/>
-        </w:rPr>
-        <w:t xml:space="preserve">43/1 (czterdzieści trzy łamane przez jeden) o obszarze </w:t>
-      </w:r>
-      <w:bookmarkEnd w:id="4"/>
-      <w:r>
-        <w:rPr>
-          <w:rFonts w:ascii="Calibri" w:hAnsi="Calibri" w:cs="Calibri"/>
-          <w:color w:val="000000"/>
-          <w:sz w:val="24"/>
-          <w:szCs w:val="24"/>
-        </w:rPr>
-        <w:t>0,3654 ha (trzy tysiące sześćset pięćdziesiąt cztery metry kwadratowe) i 44/6 (czterdzieści cztery łamane przez sześć)</w:t>
-      </w:r>
-      <w:r>
-        <w:rPr>
-          <w:rFonts w:ascii="Calibri" w:hAnsi="Calibri" w:cs="Calibri"/>
-          <w:color w:val="000000"/>
-          <w:sz w:val="24"/>
-          <w:szCs w:val="24"/>
-        </w:rPr>
-        <w:br/>
-        <w:t>o obszarze 0,7575 ha (siedem tysięcy pięćset siedemdziesiąt pięć metrów kwadratowych), które będą objęte prowadzoną przez Sąd Rejonowy w Zgierzu</w:t>
-      </w:r>
-      <w:r>
-        <w:rPr>
-          <w:rFonts w:ascii="Calibri" w:hAnsi="Calibri" w:cs="Calibri"/>
-          <w:color w:val="000000"/>
-          <w:sz w:val="24"/>
-          <w:szCs w:val="24"/>
-        </w:rPr>
-        <w:br/>
-        <w:t xml:space="preserve">V Wydział Ksiąg Wieczystych z siedzibą w Zgierzu księgą wieczystą </w:t>
-      </w:r>
-      <w:bookmarkStart w:id="5" w:name="_Hlk143665757"/>
-      <w:r>
-        <w:rPr>
-          <w:rFonts w:ascii="Calibri" w:hAnsi="Calibri" w:cs="Calibri"/>
-          <w:b/>
-          <w:bCs/>
-          <w:color w:val="000000"/>
-          <w:sz w:val="24"/>
-          <w:szCs w:val="24"/>
-        </w:rPr>
-        <w:t>LD1G/00122731/</w:t>
-      </w:r>
-      <w:bookmarkEnd w:id="5"/>
-      <w:r>
-        <w:rPr>
-          <w:rFonts w:ascii="Calibri" w:hAnsi="Calibri" w:cs="Calibri"/>
-          <w:b/>
-          <w:bCs/>
-          <w:color w:val="000000"/>
-          <w:sz w:val="24"/>
-          <w:szCs w:val="24"/>
-        </w:rPr>
-        <w:t>2</w:t>
-      </w:r>
-      <w:r>
-        <w:rPr>
-          <w:rFonts w:ascii="Calibri" w:hAnsi="Calibri" w:cs="Calibri"/>
-          <w:sz w:val="24"/>
-          <w:szCs w:val="24"/>
-        </w:rPr>
-        <w:t>,</w:t>
-      </w:r>
-      <w:r>
-        <w:rPr>
-          <w:rFonts w:ascii="Calibri" w:hAnsi="Calibri" w:cs="Calibri"/>
-          <w:b/>
-          <w:sz w:val="24"/>
-          <w:szCs w:val="24"/>
-        </w:rPr>
-        <w:t xml:space="preserve"> </w:t>
-      </w:r>
-      <w:r>
-        <w:rPr>
-          <w:rFonts w:ascii="Calibri" w:hAnsi="Calibri" w:cs="Calibri"/>
-          <w:sz w:val="24"/>
-          <w:szCs w:val="24"/>
-        </w:rPr>
-        <w:t>zamierza zrealizować inwestycję pod nazwą „</w:t>
-      </w:r>
-      <w:r>
-        <w:rPr>
-          <w:rFonts w:ascii="Calibri" w:hAnsi="Calibri" w:cs="Calibri"/>
-          <w:b/>
-          <w:sz w:val="24"/>
-          <w:szCs w:val="24"/>
-        </w:rPr>
-        <w:t>NOVA STAFFA – ETAP 1</w:t>
-      </w:r>
-      <w:r>
-        <w:rPr>
-          <w:rFonts w:ascii="Calibri" w:hAnsi="Calibri" w:cs="Calibri"/>
-          <w:sz w:val="24"/>
-          <w:szCs w:val="24"/>
-        </w:rPr>
-        <w:t>”, polegającą na wybudowaniu wolnostojącego budynku mieszkalnego wielorodzinnego (zwanego dalej „</w:t>
-      </w:r>
-      <w:r>
-        <w:rPr>
-          <w:rFonts w:ascii="Calibri" w:hAnsi="Calibri" w:cs="Calibri"/>
-          <w:b/>
-          <w:bCs/>
-          <w:sz w:val="24"/>
-          <w:szCs w:val="24"/>
-        </w:rPr>
-        <w:t>Budynkiem</w:t>
-      </w:r>
-      <w:r>
-        <w:rPr>
-          <w:rFonts w:ascii="Calibri" w:hAnsi="Calibri" w:cs="Calibri"/>
-          <w:sz w:val="24"/>
-          <w:szCs w:val="24"/>
-        </w:rPr>
-        <w:t xml:space="preserve">”) o pięciu kondygnacjach naziemnych, w ramach realizacji którego zostanie wybudowanych 59 (pięćdziesiąt dziewięć) lokali mieszkalnych na kondygnacjach od pierwszej do piątej, natomiast na kondygnacji pierwszej (parterze) – 2 (dwa) lokale usługowe i garaż wielostanowiskowy na 42 (czterdzieści dwa) miejsca postojowe dla samochodów osobowych wraz z zespołem pomieszczeń techniczno-gospodarczych (zwaną dalej </w:t>
-      </w:r>
-      <w:r>
-        <w:rPr>
-          <w:rFonts w:ascii="Calibri" w:hAnsi="Calibri" w:cs="Calibri"/>
-          <w:b/>
-          <w:sz w:val="24"/>
-          <w:szCs w:val="24"/>
-        </w:rPr>
-        <w:t>„Inwestycją</w:t>
-      </w:r>
-      <w:r>
-        <w:rPr>
-          <w:rFonts w:ascii="Calibri" w:hAnsi="Calibri" w:cs="Calibri"/>
-          <w:sz w:val="24"/>
-          <w:szCs w:val="24"/>
-        </w:rPr>
-        <w:t>”).</w:t>
+        <w:t xml:space="preserve">Przedstawiciel Dewelopera oświadcza, że na nieruchomości obejmującej teren składający się z leżących w obrębie ewidencyjnym 0125 Zgierz 125, jednostce ewidencyjnej 102003_1 Zgierz – miasto czterech działek gruntu oznaczonych numerami: 43/3 (czterdzieści trzy łamane przez trzy) o obszarze 0,0441 ha (czterysta czterdzieści jeden metrów kwadratowych), 43/4 (czterdzieści trzy łamane przez cztery) o obszarze 0,0771 ha (siedemset siedemdziesiąt jeden metrów kwadratowych), 44/8 (czterdzieści cztery łamane przez osiem) o obszarze 0,0308 ha (trzysta osiem metrów kwadratowych) oraz 44/9 (czterdzieści cztery łamane przez dziewięć) o obszarze 0,2237 ha (dwa tysiące dwieście trzydzieści siedem metrów kwadratowych), o łącznym obszarze 0,3757 ha (trzy tysiące siedemset pięćdziesiąt siedem metrów kwadratowych), które objęte są prowadzoną przez Sąd Rejonowy w Zgierzu, V Wydział Ksiąg Wieczystych z siedzibą w Zgierzu księgą wieczystą LD1G/00227305, zamierza zrealizować inwestycję pod nazwą „NOVA STAFFA – ETAP 1”, polegającą na wybudowaniu wolnostojącego budynku mieszkalnego wielorodzinnego (zwanego dalej „Budynkiem”) o pięciu kondygnacjach naziemnych, w ramach realizacji którego zostanie wybudowanych 59 (pięćdziesiąt dziewięć) lokali mieszkalnych na kondygnacjach od pierwszej do piątej, natomiast na kondygnacji pierwszej (parterze) – 2 (dwa) lokale usługowe i garaż wielostanowiskowy na 42 (czterdzieści dwa) miejsca postojowe dla samochodów osobowych wraz z zespołem pomieszczeń techniczno-gospodarczych (zwaną dalej „Inwestycją”).</w:t>
       </w:r>
     </w:p>
     <w:p>
@@ -2280,33 +2121,7 @@
           <w:sz w:val="24"/>
           <w:szCs w:val="24"/>
         </w:rPr>
-        <w:t xml:space="preserve">Jednocześnie z zawarciem umowy deweloperskiej Deweloper zawrze z Rezerwującym przedwstępną umowę sprzedaży udziału wynoszącego nie mniej niż 1/350 (jedną trzysta pięćdziesiątą) część w działkach gruntu o projektowanych numerach </w:t>
-      </w:r>
-      <w:r>
-        <w:rPr>
-          <w:rFonts w:ascii="Calibri" w:hAnsi="Calibri" w:cs="Calibri"/>
-          <w:color w:val="000000"/>
-          <w:sz w:val="24"/>
-          <w:szCs w:val="24"/>
-        </w:rPr>
-        <w:t>43/3 i</w:t>
-      </w:r>
-      <w:r>
-        <w:rPr>
-          <w:rFonts w:ascii="Calibri" w:hAnsi="Calibri" w:cs="Calibri"/>
-          <w:iCs/>
-          <w:sz w:val="24"/>
-          <w:szCs w:val="24"/>
-        </w:rPr>
-        <w:t xml:space="preserve"> 44/8 o projektowanym łącznym obszarze 0,0749 ha, zapewniającą Przedmiotowi Umowy dostęp do drogi publicznej, za cenę kwocie 369 zł (słownie: trzysta sześćdziesiąt dziewięć zł) brutto, w tym podatek VAT według stawki 23%, przy czym </w:t>
-      </w:r>
-      <w:r>
-        <w:rPr>
-          <w:rFonts w:ascii="Calibri" w:hAnsi="Calibri" w:cs="Calibri"/>
-          <w:sz w:val="24"/>
-          <w:szCs w:val="24"/>
-        </w:rPr>
-        <w:t>w przypadku zmiany wysokości stawki tego podatku cena ulegnie zmianie o kwotę zmienionego podatku VAT, na co Rezerwujący wyraża zgodę.</w:t>
+        <w:t xml:space="preserve">Jednocześnie z zawarciem umowy deweloperskiej Deweloper zawrze z Rezerwującym przedwstępną umowę sprzedaży udziału wynoszącego nie mniej niż 1/350 (jedną trzysta pięćdziesiątą) część w działkach gruntu oznaczonych numerami 43/3 i 44/8 o projektowanym łącznym obszarze 0,0749 ha, zapewniającą Przedmiotowi Umowy dostęp do drogi publicznej, za cenę kwocie 369 zł (słownie: trzysta sześćdziesiąt dziewięć zł) brutto, w tym podatek VAT według stawki 23%, przy czym w przypadku zmiany wysokości stawki tego podatku cena ulegnie zmianie o kwotę zmienionego podatku VAT, na co Rezerwujący wyraża zgodę.</w:t>
       </w:r>
     </w:p>
     <w:p>

</xml_diff>